<commit_message>
Remove redundant blank lines in CFS contract template
</commit_message>
<xml_diff>
--- a/Contracts/templates/CFS/AMS - CFS - REB - Template.docx
+++ b/Contracts/templates/CFS/AMS - CFS - REB - Template.docx
@@ -152,23 +152,7 @@
           <w:rFonts w:cstheme="minorHAnsi"/>
           <w:lang w:val="en-MY"/>
         </w:rPr>
-        <w:t xml:space="preserve"> Rd, #12-01/02 </w:t>
-      </w:r>
-      <w:proofErr w:type="spellStart"/>
-      <w:r>
-        <w:rPr>
-          <w:rFonts w:cstheme="minorHAnsi"/>
-          <w:lang w:val="en-MY"/>
-        </w:rPr>
-        <w:t>Goldbell</w:t>
-      </w:r>
-      <w:proofErr w:type="spellEnd"/>
-      <w:r>
-        <w:rPr>
-          <w:rFonts w:cstheme="minorHAnsi"/>
-          <w:lang w:val="en-MY"/>
-        </w:rPr>
-        <w:t xml:space="preserve"> Towers, Singapore 228233, Company UEN 202527765K (hereinafter referred to as “the Company”) </w:t>
+        <w:t xml:space="preserve"> Rd, #12-01/02 Goldbell Towers, Singapore 228233, Company UEN 202527765K (hereinafter referred to as “the Company”) </w:t>
       </w:r>
     </w:p>
     <w:p>
@@ -223,7 +207,7 @@
           <w:rFonts w:cstheme="minorHAnsi"/>
           <w:lang w:val="en-MY"/>
         </w:rPr>
-        <w:t xml:space="preserve">, with residential address: </w:t>
+        <w:t xml:space="preserve">, with residential address: {{ </w:t>
       </w:r>
       <w:proofErr w:type="spellStart"/>
       <w:r>
@@ -231,7 +215,7 @@
           <w:rFonts w:cstheme="minorHAnsi"/>
           <w:lang w:val="en-MY"/>
         </w:rPr>
-        <w:t>{{ residential_address }}</w:t>
+        <w:t>residential_address</w:t>
       </w:r>
       <w:proofErr w:type="spellEnd"/>
       <w:r>
@@ -239,25 +223,7 @@
           <w:rFonts w:cstheme="minorHAnsi"/>
           <w:lang w:val="en-MY"/>
         </w:rPr>
-      </w:r>
-      <w:r>
-        <w:rPr>
-          <w:rFonts w:cstheme="minorHAnsi"/>
-          <w:lang w:val="en-MY"/>
-        </w:rPr>
-      </w:r>
-      <w:r>
-        <w:rPr>
-          <w:rFonts w:cstheme="minorHAnsi"/>
-          <w:lang w:val="en-MY"/>
-        </w:rPr>
-      </w:r>
-      <w:r>
-        <w:rPr>
-          <w:rFonts w:cstheme="minorHAnsi"/>
-          <w:lang w:val="en-MY"/>
-        </w:rPr>
-        <w:t xml:space="preserve"> (hereinafter referred to as “Contractor”).</w:t>
+        <w:t xml:space="preserve"> }} (hereinafter referred to as “Contractor”).</w:t>
       </w:r>
       <w:r>
         <w:rPr>
@@ -1765,26 +1731,6 @@
     </w:p>
     <w:p>
       <w:pPr>
-        <w:spacing w:after="240" w:line="240" w:lineRule="auto"/>
-        <w:jc w:val="both"/>
-        <w:rPr>
-          <w:rFonts w:cstheme="minorHAnsi"/>
-          <w:lang w:val="en-MY"/>
-        </w:rPr>
-      </w:pPr>
-    </w:p>
-    <w:p>
-      <w:pPr>
-        <w:spacing w:after="240" w:line="240" w:lineRule="auto"/>
-        <w:jc w:val="both"/>
-        <w:rPr>
-          <w:rFonts w:cstheme="minorHAnsi"/>
-          <w:lang w:val="en-MY"/>
-        </w:rPr>
-      </w:pPr>
-    </w:p>
-    <w:p>
-      <w:pPr>
         <w:pStyle w:val="ListParagraph"/>
         <w:numPr>
           <w:ilvl w:val="0"/>
@@ -1807,7 +1753,6 @@
           <w:sz w:val="24"/>
           <w:szCs w:val="24"/>
         </w:rPr>
-        <w:lastRenderedPageBreak/>
         <w:t>Governing Law</w:t>
       </w:r>
     </w:p>
@@ -1864,6 +1809,7 @@
           <w:sz w:val="24"/>
           <w:szCs w:val="24"/>
         </w:rPr>
+        <w:lastRenderedPageBreak/>
         <w:t>Entire Agreement</w:t>
       </w:r>
     </w:p>
@@ -2262,7 +2208,6 @@
           <w:kern w:val="36"/>
           <w:lang w:val="en-SG" w:eastAsia="zh-CN"/>
         </w:rPr>
-        <w:lastRenderedPageBreak/>
         <w:t>Annex A – Scope of Services</w:t>
       </w:r>
     </w:p>
@@ -2322,6 +2267,7 @@
           <w:rFonts w:eastAsia="Times New Roman" w:cstheme="minorHAnsi"/>
           <w:lang w:val="en-SG" w:eastAsia="zh-CN"/>
         </w:rPr>
+        <w:lastRenderedPageBreak/>
         <w:t>The Contractor shall:</w:t>
       </w:r>
     </w:p>
@@ -2951,7 +2897,6 @@
           <w:rFonts w:eastAsia="Times New Roman" w:cstheme="minorHAnsi"/>
           <w:lang w:val="en-SG" w:eastAsia="zh-CN"/>
         </w:rPr>
-        <w:lastRenderedPageBreak/>
         <w:t>permit any unauthorised passenger to travel in the vehicle</w:t>
       </w:r>
     </w:p>
@@ -3108,6 +3053,7 @@
           <w:bCs/>
           <w:lang w:val="en-SG" w:eastAsia="zh-CN"/>
         </w:rPr>
+        <w:lastRenderedPageBreak/>
         <w:t>5. Reporting of Incidents</w:t>
       </w:r>
     </w:p>
@@ -9192,17 +9138,6 @@
 </file>
 
 <file path=customXml/item2.xml><?xml version="1.0" encoding="utf-8"?>
-<p:properties xmlns:p="http://schemas.microsoft.com/office/2006/metadata/properties" xmlns:xsi="http://www.w3.org/2001/XMLSchema-instance" xmlns:pc="http://schemas.microsoft.com/office/infopath/2007/PartnerControls">
-  <documentManagement>
-    <TaxCatchAll xmlns="c09eb3a2-fb88-45c3-9cb1-1cfd74c5eb43" xsi:nil="true"/>
-    <lcf76f155ced4ddcb4097134ff3c332f xmlns="69266c17-77fa-4708-8e39-c1db2b89156c">
-      <Terms xmlns="http://schemas.microsoft.com/office/infopath/2007/PartnerControls"/>
-    </lcf76f155ced4ddcb4097134ff3c332f>
-  </documentManagement>
-</p:properties>
-</file>
-
-<file path=customXml/item3.xml><?xml version="1.0" encoding="utf-8"?>
 <ct:contentTypeSchema xmlns:ct="http://schemas.microsoft.com/office/2006/metadata/contentType" xmlns:ma="http://schemas.microsoft.com/office/2006/metadata/properties/metaAttributes" ct:_="" ma:_="" ma:contentTypeName="Document" ma:contentTypeID="0x0101008106BFE721C7CD4E902C453C2A99FE5F" ma:contentTypeVersion="13" ma:contentTypeDescription="Create a new document." ma:contentTypeScope="" ma:versionID="58358959b4d4caef8582d097617399e5">
   <xsd:schema xmlns:xsd="http://www.w3.org/2001/XMLSchema" xmlns:xs="http://www.w3.org/2001/XMLSchema" xmlns:p="http://schemas.microsoft.com/office/2006/metadata/properties" xmlns:ns2="69266c17-77fa-4708-8e39-c1db2b89156c" xmlns:ns3="c09eb3a2-fb88-45c3-9cb1-1cfd74c5eb43" targetNamespace="http://schemas.microsoft.com/office/2006/metadata/properties" ma:root="true" ma:fieldsID="eb3a89178e0d6efecbb292dd368bd5f2" ns2:_="" ns3:_="">
     <xsd:import namespace="69266c17-77fa-4708-8e39-c1db2b89156c"/>
@@ -9409,6 +9344,17 @@
 </ct:contentTypeSchema>
 </file>
 
+<file path=customXml/item3.xml><?xml version="1.0" encoding="utf-8"?>
+<p:properties xmlns:p="http://schemas.microsoft.com/office/2006/metadata/properties" xmlns:xsi="http://www.w3.org/2001/XMLSchema-instance" xmlns:pc="http://schemas.microsoft.com/office/infopath/2007/PartnerControls">
+  <documentManagement>
+    <TaxCatchAll xmlns="c09eb3a2-fb88-45c3-9cb1-1cfd74c5eb43" xsi:nil="true"/>
+    <lcf76f155ced4ddcb4097134ff3c332f xmlns="69266c17-77fa-4708-8e39-c1db2b89156c">
+      <Terms xmlns="http://schemas.microsoft.com/office/infopath/2007/PartnerControls"/>
+    </lcf76f155ced4ddcb4097134ff3c332f>
+  </documentManagement>
+</p:properties>
+</file>
+
 <file path=customXml/itemProps1.xml><?xml version="1.0" encoding="utf-8"?>
 <ds:datastoreItem xmlns:ds="http://schemas.openxmlformats.org/officeDocument/2006/customXml" ds:itemID="{802D180A-C302-43D2-8AEC-97B3CB1966A5}">
   <ds:schemaRefs>
@@ -9418,16 +9364,31 @@
 </file>
 
 <file path=customXml/itemProps2.xml><?xml version="1.0" encoding="utf-8"?>
-<ds:datastoreItem xmlns:ds="http://schemas.openxmlformats.org/officeDocument/2006/customXml" ds:itemID="{E9409E10-B7F9-4E01-BB45-4620DA35DA3B}">
+<ds:datastoreItem xmlns:ds="http://schemas.openxmlformats.org/officeDocument/2006/customXml" ds:itemID="{375BA2D9-341A-490F-A380-663F05C68FCB}">
   <ds:schemaRefs>
+    <ds:schemaRef ds:uri="http://schemas.microsoft.com/office/2006/metadata/contentType"/>
+    <ds:schemaRef ds:uri="http://schemas.microsoft.com/office/2006/metadata/properties/metaAttributes"/>
+    <ds:schemaRef ds:uri="http://www.w3.org/2001/XMLSchema"/>
     <ds:schemaRef ds:uri="http://schemas.microsoft.com/office/2006/metadata/properties"/>
+    <ds:schemaRef ds:uri="69266c17-77fa-4708-8e39-c1db2b89156c"/>
+    <ds:schemaRef ds:uri="c09eb3a2-fb88-45c3-9cb1-1cfd74c5eb43"/>
+    <ds:schemaRef ds:uri="http://schemas.microsoft.com/office/2006/documentManagement/types"/>
     <ds:schemaRef ds:uri="http://schemas.microsoft.com/office/infopath/2007/PartnerControls"/>
-    <ds:schemaRef ds:uri="52299b73-db39-474c-b431-033aab11b4df"/>
-    <ds:schemaRef ds:uri="0be270d2-a00b-4821-a134-ecdd91477293"/>
+    <ds:schemaRef ds:uri="http://schemas.openxmlformats.org/package/2006/metadata/core-properties"/>
+    <ds:schemaRef ds:uri="http://purl.org/dc/elements/1.1/"/>
+    <ds:schemaRef ds:uri="http://purl.org/dc/terms/"/>
+    <ds:schemaRef ds:uri="http://schemas.microsoft.com/internal/obd"/>
   </ds:schemaRefs>
 </ds:datastoreItem>
 </file>
 
 <file path=customXml/itemProps3.xml><?xml version="1.0" encoding="utf-8"?>
-<ds:datastoreItem xmlns:ds="http://schemas.openxmlformats.org/officeDocument/2006/customXml" ds:itemID="{375BA2D9-341A-490F-A380-663F05C68FCB}"/>
+<ds:datastoreItem xmlns:ds="http://schemas.openxmlformats.org/officeDocument/2006/customXml" ds:itemID="{E9409E10-B7F9-4E01-BB45-4620DA35DA3B}">
+  <ds:schemaRefs>
+    <ds:schemaRef ds:uri="http://schemas.microsoft.com/office/2006/metadata/properties"/>
+    <ds:schemaRef ds:uri="http://schemas.microsoft.com/office/infopath/2007/PartnerControls"/>
+    <ds:schemaRef ds:uri="c09eb3a2-fb88-45c3-9cb1-1cfd74c5eb43"/>
+    <ds:schemaRef ds:uri="69266c17-77fa-4708-8e39-c1db2b89156c"/>
+  </ds:schemaRefs>
+</ds:datastoreItem>
 </file>
</xml_diff>

<commit_message>
fix: remove unnecessary blank lines from contract template
</commit_message>
<xml_diff>
--- a/Contracts/templates/CFS/AMS - CFS - REB - Template.docx
+++ b/Contracts/templates/CFS/AMS - CFS - REB - Template.docx
@@ -2113,85 +2113,6 @@
     </w:p>
     <w:p>
       <w:pPr>
-        <w:spacing w:line="240" w:lineRule="auto"/>
-        <w:rPr>
-          <w:rFonts w:cstheme="minorHAnsi"/>
-          <w:lang w:val="en-MY"/>
-        </w:rPr>
-      </w:pPr>
-    </w:p>
-    <w:p>
-      <w:pPr>
-        <w:spacing w:line="240" w:lineRule="auto"/>
-        <w:rPr>
-          <w:rFonts w:cstheme="minorHAnsi"/>
-          <w:lang w:val="en-MY"/>
-        </w:rPr>
-      </w:pPr>
-    </w:p>
-    <w:p>
-      <w:pPr>
-        <w:spacing w:line="240" w:lineRule="auto"/>
-        <w:rPr>
-          <w:rFonts w:cstheme="minorHAnsi"/>
-          <w:lang w:val="en-MY"/>
-        </w:rPr>
-      </w:pPr>
-    </w:p>
-    <w:p>
-      <w:pPr>
-        <w:spacing w:line="240" w:lineRule="auto"/>
-        <w:rPr>
-          <w:rFonts w:cstheme="minorHAnsi"/>
-          <w:lang w:val="en-MY"/>
-        </w:rPr>
-      </w:pPr>
-    </w:p>
-    <w:p>
-      <w:pPr>
-        <w:spacing w:line="240" w:lineRule="auto"/>
-        <w:rPr>
-          <w:rFonts w:cstheme="minorHAnsi"/>
-          <w:lang w:val="en-MY"/>
-        </w:rPr>
-      </w:pPr>
-    </w:p>
-    <w:p>
-      <w:pPr>
-        <w:spacing w:line="240" w:lineRule="auto"/>
-        <w:rPr>
-          <w:rFonts w:cstheme="minorHAnsi"/>
-          <w:lang w:val="en-MY"/>
-        </w:rPr>
-      </w:pPr>
-    </w:p>
-    <w:p>
-      <w:pPr>
-        <w:spacing w:line="240" w:lineRule="auto"/>
-        <w:rPr>
-          <w:rFonts w:cstheme="minorHAnsi"/>
-          <w:lang w:val="en-MY"/>
-        </w:rPr>
-      </w:pPr>
-    </w:p>
-    <w:p>
-      <w:pPr>
-        <w:adjustRightInd w:val="0"/>
-        <w:snapToGrid w:val="0"/>
-        <w:spacing w:line="240" w:lineRule="auto"/>
-        <w:outlineLvl w:val="0"/>
-        <w:rPr>
-          <w:rFonts w:cstheme="minorHAnsi"/>
-          <w:lang w:val="en-MY"/>
-        </w:rPr>
-      </w:pPr>
-    </w:p>
-    <w:p>
-      <w:pPr>
-        <w:adjustRightInd w:val="0"/>
-        <w:snapToGrid w:val="0"/>
-        <w:spacing w:line="240" w:lineRule="auto"/>
-        <w:outlineLvl w:val="0"/>
         <w:rPr>
           <w:rFonts w:eastAsia="Times New Roman" w:cstheme="minorHAnsi"/>
           <w:b/>
@@ -2202,12 +2123,20 @@
       </w:pPr>
       <w:r>
         <w:rPr>
+          <w:rFonts w:cstheme="minorHAnsi"/>
+          <w:lang w:val="en-MY"/>
+        </w:rPr>
+        <w:br w:type="page"/>
+      </w:r>
+      <w:r>
+        <w:rPr>
           <w:rFonts w:eastAsia="Times New Roman" w:cstheme="minorHAnsi"/>
           <w:b/>
           <w:bCs/>
           <w:kern w:val="36"/>
           <w:lang w:val="en-SG" w:eastAsia="zh-CN"/>
         </w:rPr>
+        <w:lastRenderedPageBreak/>
         <w:t>Annex A – Scope of Services</w:t>
       </w:r>
     </w:p>
@@ -2267,7 +2196,6 @@
           <w:rFonts w:eastAsia="Times New Roman" w:cstheme="minorHAnsi"/>
           <w:lang w:val="en-SG" w:eastAsia="zh-CN"/>
         </w:rPr>
-        <w:lastRenderedPageBreak/>
         <w:t>The Contractor shall:</w:t>
       </w:r>
     </w:p>
@@ -2897,6 +2825,7 @@
           <w:rFonts w:eastAsia="Times New Roman" w:cstheme="minorHAnsi"/>
           <w:lang w:val="en-SG" w:eastAsia="zh-CN"/>
         </w:rPr>
+        <w:lastRenderedPageBreak/>
         <w:t>permit any unauthorised passenger to travel in the vehicle</w:t>
       </w:r>
     </w:p>
@@ -3053,7 +2982,6 @@
           <w:bCs/>
           <w:lang w:val="en-SG" w:eastAsia="zh-CN"/>
         </w:rPr>
-        <w:lastRenderedPageBreak/>
         <w:t>5. Reporting of Incidents</w:t>
       </w:r>
     </w:p>
@@ -9138,6 +9066,17 @@
 </file>
 
 <file path=customXml/item2.xml><?xml version="1.0" encoding="utf-8"?>
+<p:properties xmlns:p="http://schemas.microsoft.com/office/2006/metadata/properties" xmlns:xsi="http://www.w3.org/2001/XMLSchema-instance" xmlns:pc="http://schemas.microsoft.com/office/infopath/2007/PartnerControls">
+  <documentManagement>
+    <TaxCatchAll xmlns="c09eb3a2-fb88-45c3-9cb1-1cfd74c5eb43" xsi:nil="true"/>
+    <lcf76f155ced4ddcb4097134ff3c332f xmlns="69266c17-77fa-4708-8e39-c1db2b89156c">
+      <Terms xmlns="http://schemas.microsoft.com/office/infopath/2007/PartnerControls"/>
+    </lcf76f155ced4ddcb4097134ff3c332f>
+  </documentManagement>
+</p:properties>
+</file>
+
+<file path=customXml/item3.xml><?xml version="1.0" encoding="utf-8"?>
 <ct:contentTypeSchema xmlns:ct="http://schemas.microsoft.com/office/2006/metadata/contentType" xmlns:ma="http://schemas.microsoft.com/office/2006/metadata/properties/metaAttributes" ct:_="" ma:_="" ma:contentTypeName="Document" ma:contentTypeID="0x0101008106BFE721C7CD4E902C453C2A99FE5F" ma:contentTypeVersion="13" ma:contentTypeDescription="Create a new document." ma:contentTypeScope="" ma:versionID="58358959b4d4caef8582d097617399e5">
   <xsd:schema xmlns:xsd="http://www.w3.org/2001/XMLSchema" xmlns:xs="http://www.w3.org/2001/XMLSchema" xmlns:p="http://schemas.microsoft.com/office/2006/metadata/properties" xmlns:ns2="69266c17-77fa-4708-8e39-c1db2b89156c" xmlns:ns3="c09eb3a2-fb88-45c3-9cb1-1cfd74c5eb43" targetNamespace="http://schemas.microsoft.com/office/2006/metadata/properties" ma:root="true" ma:fieldsID="eb3a89178e0d6efecbb292dd368bd5f2" ns2:_="" ns3:_="">
     <xsd:import namespace="69266c17-77fa-4708-8e39-c1db2b89156c"/>
@@ -9344,17 +9283,6 @@
 </ct:contentTypeSchema>
 </file>
 
-<file path=customXml/item3.xml><?xml version="1.0" encoding="utf-8"?>
-<p:properties xmlns:p="http://schemas.microsoft.com/office/2006/metadata/properties" xmlns:xsi="http://www.w3.org/2001/XMLSchema-instance" xmlns:pc="http://schemas.microsoft.com/office/infopath/2007/PartnerControls">
-  <documentManagement>
-    <TaxCatchAll xmlns="c09eb3a2-fb88-45c3-9cb1-1cfd74c5eb43" xsi:nil="true"/>
-    <lcf76f155ced4ddcb4097134ff3c332f xmlns="69266c17-77fa-4708-8e39-c1db2b89156c">
-      <Terms xmlns="http://schemas.microsoft.com/office/infopath/2007/PartnerControls"/>
-    </lcf76f155ced4ddcb4097134ff3c332f>
-  </documentManagement>
-</p:properties>
-</file>
-
 <file path=customXml/itemProps1.xml><?xml version="1.0" encoding="utf-8"?>
 <ds:datastoreItem xmlns:ds="http://schemas.openxmlformats.org/officeDocument/2006/customXml" ds:itemID="{802D180A-C302-43D2-8AEC-97B3CB1966A5}">
   <ds:schemaRefs>
@@ -9364,6 +9292,17 @@
 </file>
 
 <file path=customXml/itemProps2.xml><?xml version="1.0" encoding="utf-8"?>
+<ds:datastoreItem xmlns:ds="http://schemas.openxmlformats.org/officeDocument/2006/customXml" ds:itemID="{E9409E10-B7F9-4E01-BB45-4620DA35DA3B}">
+  <ds:schemaRefs>
+    <ds:schemaRef ds:uri="http://schemas.microsoft.com/office/2006/metadata/properties"/>
+    <ds:schemaRef ds:uri="http://schemas.microsoft.com/office/infopath/2007/PartnerControls"/>
+    <ds:schemaRef ds:uri="c09eb3a2-fb88-45c3-9cb1-1cfd74c5eb43"/>
+    <ds:schemaRef ds:uri="69266c17-77fa-4708-8e39-c1db2b89156c"/>
+  </ds:schemaRefs>
+</ds:datastoreItem>
+</file>
+
+<file path=customXml/itemProps3.xml><?xml version="1.0" encoding="utf-8"?>
 <ds:datastoreItem xmlns:ds="http://schemas.openxmlformats.org/officeDocument/2006/customXml" ds:itemID="{375BA2D9-341A-490F-A380-663F05C68FCB}">
   <ds:schemaRefs>
     <ds:schemaRef ds:uri="http://schemas.microsoft.com/office/2006/metadata/contentType"/>
@@ -9380,15 +9319,4 @@
     <ds:schemaRef ds:uri="http://schemas.microsoft.com/internal/obd"/>
   </ds:schemaRefs>
 </ds:datastoreItem>
-</file>
-
-<file path=customXml/itemProps3.xml><?xml version="1.0" encoding="utf-8"?>
-<ds:datastoreItem xmlns:ds="http://schemas.openxmlformats.org/officeDocument/2006/customXml" ds:itemID="{E9409E10-B7F9-4E01-BB45-4620DA35DA3B}">
-  <ds:schemaRefs>
-    <ds:schemaRef ds:uri="http://schemas.microsoft.com/office/2006/metadata/properties"/>
-    <ds:schemaRef ds:uri="http://schemas.microsoft.com/office/infopath/2007/PartnerControls"/>
-    <ds:schemaRef ds:uri="c09eb3a2-fb88-45c3-9cb1-1cfd74c5eb43"/>
-    <ds:schemaRef ds:uri="69266c17-77fa-4708-8e39-c1db2b89156c"/>
-  </ds:schemaRefs>
-</ds:datastoreItem>
 </file>
</xml_diff>

<commit_message>
fix: update LibreOffice Portable download URL and improve installation script
</commit_message>
<xml_diff>
--- a/Contracts/templates/CFS/AMS - CFS - REB - Template.docx
+++ b/Contracts/templates/CFS/AMS - CFS - REB - Template.docx
@@ -248,15 +248,6 @@
         </w:rPr>
         <w:t>The parties shall be collectively referred to as the “Parties” and individually as a “Party”.</w:t>
       </w:r>
-    </w:p>
-    <w:p>
-      <w:pPr>
-        <w:spacing w:line="240" w:lineRule="auto"/>
-        <w:rPr>
-          <w:rFonts w:cstheme="minorHAnsi"/>
-          <w:lang w:val="en-MY"/>
-        </w:rPr>
-      </w:pPr>
     </w:p>
     <w:p>
       <w:pPr>
@@ -1979,7 +1970,55 @@
           <w:rFonts w:cstheme="minorHAnsi"/>
           <w:lang w:val="en-MY"/>
         </w:rPr>
-        <w:t xml:space="preserve">Date: {{ agreement_date }} </w:t>
+        <w:t xml:space="preserve">Date: </w:t>
+      </w:r>
+      <w:proofErr w:type="gramStart"/>
+      <w:r>
+        <w:rPr>
+          <w:rFonts w:cstheme="minorHAnsi"/>
+          <w:lang w:val="en-MY"/>
+        </w:rPr>
+        <w:t xml:space="preserve">{{ </w:t>
+      </w:r>
+      <w:proofErr w:type="spellStart"/>
+      <w:r>
+        <w:rPr>
+          <w:rFonts w:cstheme="minorHAnsi"/>
+          <w:lang w:val="en-MY"/>
+        </w:rPr>
+        <w:t>agreement</w:t>
+      </w:r>
+      <w:proofErr w:type="gramEnd"/>
+      <w:r>
+        <w:rPr>
+          <w:rFonts w:cstheme="minorHAnsi"/>
+          <w:lang w:val="en-MY"/>
+        </w:rPr>
+        <w:t>_</w:t>
+      </w:r>
+      <w:proofErr w:type="gramStart"/>
+      <w:r>
+        <w:rPr>
+          <w:rFonts w:cstheme="minorHAnsi"/>
+          <w:lang w:val="en-MY"/>
+        </w:rPr>
+        <w:t>date</w:t>
+      </w:r>
+      <w:proofErr w:type="spellEnd"/>
+      <w:r>
+        <w:rPr>
+          <w:rFonts w:cstheme="minorHAnsi"/>
+          <w:lang w:val="en-MY"/>
+        </w:rPr>
+        <w:t xml:space="preserve"> }</w:t>
+      </w:r>
+      <w:proofErr w:type="gramEnd"/>
+      <w:r>
+        <w:rPr>
+          <w:rFonts w:cstheme="minorHAnsi"/>
+          <w:lang w:val="en-MY"/>
+        </w:rPr>
+        <w:t xml:space="preserve">} </w:t>
       </w:r>
     </w:p>
     <w:p>
@@ -2082,6 +2121,7 @@
         </w:rPr>
         <w:t xml:space="preserve">Name: </w:t>
       </w:r>
+      <w:proofErr w:type="gramStart"/>
       <w:r>
         <w:rPr>
           <w:rFonts w:cstheme="minorHAnsi"/>
@@ -2089,7 +2129,57 @@
           <w:bCs/>
           <w:lang w:val="en-MY"/>
         </w:rPr>
-        <w:t>{{ contractor_name }}</w:t>
+        <w:t xml:space="preserve">{{ </w:t>
+      </w:r>
+      <w:proofErr w:type="spellStart"/>
+      <w:r>
+        <w:rPr>
+          <w:rFonts w:cstheme="minorHAnsi"/>
+          <w:b/>
+          <w:bCs/>
+          <w:lang w:val="en-MY"/>
+        </w:rPr>
+        <w:t>contractor</w:t>
+      </w:r>
+      <w:proofErr w:type="gramEnd"/>
+      <w:r>
+        <w:rPr>
+          <w:rFonts w:cstheme="minorHAnsi"/>
+          <w:b/>
+          <w:bCs/>
+          <w:lang w:val="en-MY"/>
+        </w:rPr>
+        <w:t>_</w:t>
+      </w:r>
+      <w:proofErr w:type="gramStart"/>
+      <w:r>
+        <w:rPr>
+          <w:rFonts w:cstheme="minorHAnsi"/>
+          <w:b/>
+          <w:bCs/>
+          <w:lang w:val="en-MY"/>
+        </w:rPr>
+        <w:t>name</w:t>
+      </w:r>
+      <w:proofErr w:type="spellEnd"/>
+      <w:r>
+        <w:rPr>
+          <w:rFonts w:cstheme="minorHAnsi"/>
+          <w:b/>
+          <w:bCs/>
+          <w:lang w:val="en-MY"/>
+        </w:rPr>
+        <w:t xml:space="preserve"> }</w:t>
+      </w:r>
+      <w:proofErr w:type="gramEnd"/>
+      <w:r>
+        <w:rPr>
+          <w:rFonts w:cstheme="minorHAnsi"/>
+          <w:b/>
+          <w:bCs/>
+          <w:lang w:val="en-MY"/>
+        </w:rPr>
+        <w:t>}</w:t>
       </w:r>
     </w:p>
     <w:p>
@@ -2108,8 +2198,65 @@
           <w:rFonts w:cstheme="minorHAnsi"/>
           <w:lang w:val="en-MY"/>
         </w:rPr>
-        <w:t>Date: {{ agreement_date }}</w:t>
-      </w:r>
+        <w:t xml:space="preserve">Date: </w:t>
+      </w:r>
+      <w:proofErr w:type="gramStart"/>
+      <w:r>
+        <w:rPr>
+          <w:rFonts w:cstheme="minorHAnsi"/>
+          <w:lang w:val="en-MY"/>
+        </w:rPr>
+        <w:t xml:space="preserve">{{ </w:t>
+      </w:r>
+      <w:proofErr w:type="spellStart"/>
+      <w:r>
+        <w:rPr>
+          <w:rFonts w:cstheme="minorHAnsi"/>
+          <w:lang w:val="en-MY"/>
+        </w:rPr>
+        <w:t>agreement</w:t>
+      </w:r>
+      <w:proofErr w:type="gramEnd"/>
+      <w:r>
+        <w:rPr>
+          <w:rFonts w:cstheme="minorHAnsi"/>
+          <w:lang w:val="en-MY"/>
+        </w:rPr>
+        <w:t>_</w:t>
+      </w:r>
+      <w:proofErr w:type="gramStart"/>
+      <w:r>
+        <w:rPr>
+          <w:rFonts w:cstheme="minorHAnsi"/>
+          <w:lang w:val="en-MY"/>
+        </w:rPr>
+        <w:t>date</w:t>
+      </w:r>
+      <w:proofErr w:type="spellEnd"/>
+      <w:r>
+        <w:rPr>
+          <w:rFonts w:cstheme="minorHAnsi"/>
+          <w:lang w:val="en-MY"/>
+        </w:rPr>
+        <w:t xml:space="preserve"> }</w:t>
+      </w:r>
+      <w:proofErr w:type="gramEnd"/>
+      <w:r>
+        <w:rPr>
+          <w:rFonts w:cstheme="minorHAnsi"/>
+          <w:lang w:val="en-MY"/>
+        </w:rPr>
+        <w:t>}</w:t>
+      </w:r>
+    </w:p>
+    <w:p>
+      <w:pPr>
+        <w:spacing w:after="240" w:line="240" w:lineRule="auto"/>
+        <w:jc w:val="both"/>
+        <w:rPr>
+          <w:rFonts w:cstheme="minorHAnsi"/>
+        </w:rPr>
+      </w:pPr>
     </w:p>
     <w:p>
       <w:pPr>
@@ -9066,17 +9213,6 @@
 </file>
 
 <file path=customXml/item2.xml><?xml version="1.0" encoding="utf-8"?>
-<p:properties xmlns:p="http://schemas.microsoft.com/office/2006/metadata/properties" xmlns:xsi="http://www.w3.org/2001/XMLSchema-instance" xmlns:pc="http://schemas.microsoft.com/office/infopath/2007/PartnerControls">
-  <documentManagement>
-    <TaxCatchAll xmlns="c09eb3a2-fb88-45c3-9cb1-1cfd74c5eb43" xsi:nil="true"/>
-    <lcf76f155ced4ddcb4097134ff3c332f xmlns="69266c17-77fa-4708-8e39-c1db2b89156c">
-      <Terms xmlns="http://schemas.microsoft.com/office/infopath/2007/PartnerControls"/>
-    </lcf76f155ced4ddcb4097134ff3c332f>
-  </documentManagement>
-</p:properties>
-</file>
-
-<file path=customXml/item3.xml><?xml version="1.0" encoding="utf-8"?>
 <ct:contentTypeSchema xmlns:ct="http://schemas.microsoft.com/office/2006/metadata/contentType" xmlns:ma="http://schemas.microsoft.com/office/2006/metadata/properties/metaAttributes" ct:_="" ma:_="" ma:contentTypeName="Document" ma:contentTypeID="0x0101008106BFE721C7CD4E902C453C2A99FE5F" ma:contentTypeVersion="13" ma:contentTypeDescription="Create a new document." ma:contentTypeScope="" ma:versionID="58358959b4d4caef8582d097617399e5">
   <xsd:schema xmlns:xsd="http://www.w3.org/2001/XMLSchema" xmlns:xs="http://www.w3.org/2001/XMLSchema" xmlns:p="http://schemas.microsoft.com/office/2006/metadata/properties" xmlns:ns2="69266c17-77fa-4708-8e39-c1db2b89156c" xmlns:ns3="c09eb3a2-fb88-45c3-9cb1-1cfd74c5eb43" targetNamespace="http://schemas.microsoft.com/office/2006/metadata/properties" ma:root="true" ma:fieldsID="eb3a89178e0d6efecbb292dd368bd5f2" ns2:_="" ns3:_="">
     <xsd:import namespace="69266c17-77fa-4708-8e39-c1db2b89156c"/>
@@ -9283,6 +9419,17 @@
 </ct:contentTypeSchema>
 </file>
 
+<file path=customXml/item3.xml><?xml version="1.0" encoding="utf-8"?>
+<p:properties xmlns:p="http://schemas.microsoft.com/office/2006/metadata/properties" xmlns:xsi="http://www.w3.org/2001/XMLSchema-instance" xmlns:pc="http://schemas.microsoft.com/office/infopath/2007/PartnerControls">
+  <documentManagement>
+    <TaxCatchAll xmlns="c09eb3a2-fb88-45c3-9cb1-1cfd74c5eb43" xsi:nil="true"/>
+    <lcf76f155ced4ddcb4097134ff3c332f xmlns="69266c17-77fa-4708-8e39-c1db2b89156c">
+      <Terms xmlns="http://schemas.microsoft.com/office/infopath/2007/PartnerControls"/>
+    </lcf76f155ced4ddcb4097134ff3c332f>
+  </documentManagement>
+</p:properties>
+</file>
+
 <file path=customXml/itemProps1.xml><?xml version="1.0" encoding="utf-8"?>
 <ds:datastoreItem xmlns:ds="http://schemas.openxmlformats.org/officeDocument/2006/customXml" ds:itemID="{802D180A-C302-43D2-8AEC-97B3CB1966A5}">
   <ds:schemaRefs>
@@ -9292,17 +9439,6 @@
 </file>
 
 <file path=customXml/itemProps2.xml><?xml version="1.0" encoding="utf-8"?>
-<ds:datastoreItem xmlns:ds="http://schemas.openxmlformats.org/officeDocument/2006/customXml" ds:itemID="{E9409E10-B7F9-4E01-BB45-4620DA35DA3B}">
-  <ds:schemaRefs>
-    <ds:schemaRef ds:uri="http://schemas.microsoft.com/office/2006/metadata/properties"/>
-    <ds:schemaRef ds:uri="http://schemas.microsoft.com/office/infopath/2007/PartnerControls"/>
-    <ds:schemaRef ds:uri="c09eb3a2-fb88-45c3-9cb1-1cfd74c5eb43"/>
-    <ds:schemaRef ds:uri="69266c17-77fa-4708-8e39-c1db2b89156c"/>
-  </ds:schemaRefs>
-</ds:datastoreItem>
-</file>
-
-<file path=customXml/itemProps3.xml><?xml version="1.0" encoding="utf-8"?>
 <ds:datastoreItem xmlns:ds="http://schemas.openxmlformats.org/officeDocument/2006/customXml" ds:itemID="{375BA2D9-341A-490F-A380-663F05C68FCB}">
   <ds:schemaRefs>
     <ds:schemaRef ds:uri="http://schemas.microsoft.com/office/2006/metadata/contentType"/>
@@ -9319,4 +9455,15 @@
     <ds:schemaRef ds:uri="http://schemas.microsoft.com/internal/obd"/>
   </ds:schemaRefs>
 </ds:datastoreItem>
+</file>
+
+<file path=customXml/itemProps3.xml><?xml version="1.0" encoding="utf-8"?>
+<ds:datastoreItem xmlns:ds="http://schemas.openxmlformats.org/officeDocument/2006/customXml" ds:itemID="{E9409E10-B7F9-4E01-BB45-4620DA35DA3B}">
+  <ds:schemaRefs>
+    <ds:schemaRef ds:uri="http://schemas.microsoft.com/office/2006/metadata/properties"/>
+    <ds:schemaRef ds:uri="http://schemas.microsoft.com/office/infopath/2007/PartnerControls"/>
+    <ds:schemaRef ds:uri="c09eb3a2-fb88-45c3-9cb1-1cfd74c5eb43"/>
+    <ds:schemaRef ds:uri="69266c17-77fa-4708-8e39-c1db2b89156c"/>
+  </ds:schemaRefs>
+</ds:datastoreItem>
 </file>
</xml_diff>

<commit_message>
feat: enhance CFS document generation with pagination controls and section headings
</commit_message>
<xml_diff>
--- a/Contracts/templates/CFS/AMS - CFS - REB - Template.docx
+++ b/Contracts/templates/CFS/AMS - CFS - REB - Template.docx
@@ -4,6 +4,9 @@
   <w:body>
     <w:p>
       <w:pPr>
+        <w:keepNext/>
+        <w:keepLines/>
+        <w:widowControl/>
         <w:spacing w:line="240" w:lineRule="auto"/>
         <w:jc w:val="center"/>
         <w:rPr>
@@ -25,6 +28,9 @@
     </w:p>
     <w:p>
       <w:pPr>
+        <w:keepNext/>
+        <w:keepLines/>
+        <w:widowControl/>
         <w:spacing w:line="240" w:lineRule="auto"/>
         <w:rPr>
           <w:rFonts w:cstheme="minorHAnsi"/>
@@ -98,6 +104,9 @@
     </w:p>
     <w:p>
       <w:pPr>
+        <w:keepNext/>
+        <w:keepLines/>
+        <w:widowControl/>
         <w:spacing w:line="240" w:lineRule="auto"/>
         <w:rPr>
           <w:rFonts w:cstheme="minorHAnsi"/>
@@ -116,6 +125,9 @@
     </w:p>
     <w:p>
       <w:pPr>
+        <w:keepNext/>
+        <w:keepLines/>
+        <w:widowControl/>
         <w:spacing w:line="240" w:lineRule="auto"/>
         <w:rPr>
           <w:rFonts w:cstheme="minorHAnsi"/>
@@ -157,6 +169,9 @@
     </w:p>
     <w:p>
       <w:pPr>
+        <w:keepNext/>
+        <w:keepLines/>
+        <w:widowControl/>
         <w:spacing w:line="240" w:lineRule="auto"/>
         <w:rPr>
           <w:rFonts w:cstheme="minorHAnsi"/>
@@ -173,6 +188,9 @@
     </w:p>
     <w:p>
       <w:pPr>
+        <w:keepNext/>
+        <w:keepLines/>
+        <w:widowControl/>
         <w:spacing w:line="240" w:lineRule="auto"/>
         <w:rPr>
           <w:rFonts w:cstheme="minorHAnsi"/>
@@ -235,6 +253,9 @@
     </w:p>
     <w:p>
       <w:pPr>
+        <w:keepNext w:val="0"/>
+        <w:keepLines/>
+        <w:widowControl/>
         <w:spacing w:line="240" w:lineRule="auto"/>
         <w:rPr>
           <w:rFonts w:cstheme="minorHAnsi"/>
@@ -252,6 +273,9 @@
     <w:p>
       <w:pPr>
         <w:pStyle w:val="ListParagraph"/>
+        <w:keepNext/>
+        <w:keepLines/>
+        <w:widowControl/>
         <w:numPr>
           <w:ilvl w:val="0"/>
           <w:numId w:val="13"/>
@@ -280,6 +304,9 @@
     </w:p>
     <w:p>
       <w:pPr>
+        <w:keepNext w:val="0"/>
+        <w:keepLines/>
+        <w:widowControl/>
         <w:spacing w:after="240" w:line="240" w:lineRule="auto"/>
         <w:jc w:val="both"/>
         <w:rPr>
@@ -297,6 +324,9 @@
     <w:p>
       <w:pPr>
         <w:pStyle w:val="ListParagraph"/>
+        <w:keepNext/>
+        <w:keepLines/>
+        <w:widowControl/>
         <w:numPr>
           <w:ilvl w:val="0"/>
           <w:numId w:val="13"/>
@@ -326,6 +356,9 @@
     <w:p>
       <w:pPr>
         <w:pStyle w:val="ListParagraph"/>
+        <w:keepNext/>
+        <w:keepLines/>
+        <w:widowControl/>
         <w:numPr>
           <w:ilvl w:val="1"/>
           <w:numId w:val="13"/>
@@ -348,6 +381,9 @@
     <w:p>
       <w:pPr>
         <w:pStyle w:val="ListParagraph"/>
+        <w:keepNext/>
+        <w:keepLines/>
+        <w:widowControl/>
         <w:numPr>
           <w:ilvl w:val="1"/>
           <w:numId w:val="13"/>
@@ -370,6 +406,9 @@
     <w:p>
       <w:pPr>
         <w:pStyle w:val="ListParagraph"/>
+        <w:keepNext/>
+        <w:keepLines/>
+        <w:widowControl/>
         <w:numPr>
           <w:ilvl w:val="1"/>
           <w:numId w:val="13"/>
@@ -392,6 +431,9 @@
     <w:p>
       <w:pPr>
         <w:pStyle w:val="ListParagraph"/>
+        <w:keepNext w:val="0"/>
+        <w:keepLines/>
+        <w:widowControl/>
         <w:numPr>
           <w:ilvl w:val="1"/>
           <w:numId w:val="13"/>
@@ -414,6 +456,9 @@
     <w:p>
       <w:pPr>
         <w:pStyle w:val="ListParagraph"/>
+        <w:keepNext/>
+        <w:keepLines/>
+        <w:widowControl/>
         <w:numPr>
           <w:ilvl w:val="0"/>
           <w:numId w:val="13"/>
@@ -442,6 +487,9 @@
     </w:p>
     <w:p>
       <w:pPr>
+        <w:keepNext/>
+        <w:keepLines/>
+        <w:widowControl/>
         <w:spacing w:after="240" w:line="240" w:lineRule="auto"/>
         <w:jc w:val="both"/>
         <w:rPr>
@@ -489,6 +537,9 @@
     </w:p>
     <w:p>
       <w:pPr>
+        <w:keepNext w:val="0"/>
+        <w:keepLines/>
+        <w:widowControl/>
         <w:spacing w:after="240" w:line="240" w:lineRule="auto"/>
         <w:jc w:val="both"/>
         <w:rPr>
@@ -505,6 +556,9 @@
     <w:p>
       <w:pPr>
         <w:pStyle w:val="ListParagraph"/>
+        <w:keepNext/>
+        <w:keepLines/>
+        <w:widowControl/>
         <w:numPr>
           <w:ilvl w:val="0"/>
           <w:numId w:val="13"/>
@@ -531,6 +585,9 @@
     </w:p>
     <w:p>
       <w:pPr>
+        <w:keepNext/>
+        <w:keepLines/>
+        <w:widowControl/>
         <w:spacing w:after="240" w:line="240" w:lineRule="auto"/>
         <w:jc w:val="both"/>
         <w:rPr>
@@ -560,6 +617,9 @@
     </w:p>
     <w:p>
       <w:pPr>
+        <w:keepNext w:val="0"/>
+        <w:keepLines/>
+        <w:widowControl/>
         <w:spacing w:after="240" w:line="240" w:lineRule="auto"/>
         <w:jc w:val="both"/>
         <w:rPr>
@@ -576,6 +636,9 @@
     <w:p>
       <w:pPr>
         <w:pStyle w:val="ListParagraph"/>
+        <w:keepNext/>
+        <w:keepLines/>
+        <w:widowControl/>
         <w:numPr>
           <w:ilvl w:val="0"/>
           <w:numId w:val="13"/>
@@ -606,6 +669,9 @@
     <w:p>
       <w:pPr>
         <w:pStyle w:val="ListParagraph"/>
+        <w:keepNext/>
+        <w:keepLines/>
+        <w:widowControl/>
         <w:numPr>
           <w:ilvl w:val="0"/>
           <w:numId w:val="23"/>
@@ -628,6 +694,9 @@
     <w:p>
       <w:pPr>
         <w:pStyle w:val="ListParagraph"/>
+        <w:keepNext/>
+        <w:keepLines/>
+        <w:widowControl/>
         <w:numPr>
           <w:ilvl w:val="0"/>
           <w:numId w:val="23"/>
@@ -650,6 +719,9 @@
     <w:p>
       <w:pPr>
         <w:pStyle w:val="ListParagraph"/>
+        <w:keepNext w:val="0"/>
+        <w:keepLines/>
+        <w:widowControl/>
         <w:numPr>
           <w:ilvl w:val="0"/>
           <w:numId w:val="23"/>
@@ -672,6 +744,9 @@
     <w:p>
       <w:pPr>
         <w:pStyle w:val="ListParagraph"/>
+        <w:keepNext/>
+        <w:keepLines/>
+        <w:widowControl/>
         <w:numPr>
           <w:ilvl w:val="0"/>
           <w:numId w:val="13"/>
@@ -702,6 +777,9 @@
     <w:p>
       <w:pPr>
         <w:pStyle w:val="ListParagraph"/>
+        <w:keepNext/>
+        <w:keepLines/>
+        <w:widowControl/>
         <w:numPr>
           <w:ilvl w:val="0"/>
           <w:numId w:val="24"/>
@@ -724,6 +802,9 @@
     <w:p>
       <w:pPr>
         <w:pStyle w:val="ListParagraph"/>
+        <w:keepNext/>
+        <w:keepLines/>
+        <w:widowControl/>
         <w:numPr>
           <w:ilvl w:val="0"/>
           <w:numId w:val="24"/>
@@ -746,6 +827,9 @@
     <w:p>
       <w:pPr>
         <w:pStyle w:val="ListParagraph"/>
+        <w:keepNext/>
+        <w:keepLines/>
+        <w:widowControl/>
         <w:numPr>
           <w:ilvl w:val="0"/>
           <w:numId w:val="24"/>
@@ -768,6 +852,9 @@
     <w:p>
       <w:pPr>
         <w:pStyle w:val="ListParagraph"/>
+        <w:keepNext w:val="0"/>
+        <w:keepLines/>
+        <w:widowControl/>
         <w:numPr>
           <w:ilvl w:val="0"/>
           <w:numId w:val="24"/>
@@ -790,6 +877,9 @@
     <w:p>
       <w:pPr>
         <w:pStyle w:val="ListParagraph"/>
+        <w:keepNext/>
+        <w:keepLines/>
+        <w:widowControl/>
         <w:numPr>
           <w:ilvl w:val="0"/>
           <w:numId w:val="13"/>
@@ -818,6 +908,9 @@
     </w:p>
     <w:p>
       <w:pPr>
+        <w:keepNext w:val="0"/>
+        <w:keepLines/>
+        <w:widowControl/>
         <w:spacing w:after="240" w:line="240" w:lineRule="auto"/>
         <w:jc w:val="both"/>
         <w:rPr>
@@ -836,6 +929,9 @@
     <w:p>
       <w:pPr>
         <w:pStyle w:val="ListParagraph"/>
+        <w:keepNext/>
+        <w:keepLines/>
+        <w:widowControl/>
         <w:numPr>
           <w:ilvl w:val="0"/>
           <w:numId w:val="13"/>
@@ -864,6 +960,9 @@
     </w:p>
     <w:p>
       <w:pPr>
+        <w:keepNext w:val="0"/>
+        <w:keepLines/>
+        <w:widowControl/>
         <w:spacing w:after="240" w:line="240" w:lineRule="auto"/>
         <w:jc w:val="both"/>
         <w:rPr>
@@ -881,6 +980,9 @@
     </w:p>
     <w:p>
       <w:pPr>
+        <w:keepNext w:val="0"/>
+        <w:keepLines/>
+        <w:widowControl/>
         <w:spacing w:after="240" w:line="240" w:lineRule="auto"/>
         <w:jc w:val="both"/>
         <w:rPr>
@@ -891,6 +993,9 @@
     </w:p>
     <w:p>
       <w:pPr>
+        <w:keepNext w:val="0"/>
+        <w:keepLines/>
+        <w:widowControl/>
         <w:spacing w:after="240" w:line="240" w:lineRule="auto"/>
         <w:jc w:val="both"/>
         <w:rPr>
@@ -902,6 +1007,9 @@
     <w:p>
       <w:pPr>
         <w:pStyle w:val="ListParagraph"/>
+        <w:keepNext/>
+        <w:keepLines/>
+        <w:widowControl/>
         <w:numPr>
           <w:ilvl w:val="0"/>
           <w:numId w:val="13"/>
@@ -934,6 +1042,9 @@
     </w:p>
     <w:p>
       <w:pPr>
+        <w:keepNext w:val="0"/>
+        <w:keepLines/>
+        <w:widowControl/>
         <w:spacing w:after="240" w:line="240" w:lineRule="auto"/>
         <w:jc w:val="both"/>
         <w:rPr>
@@ -980,6 +1091,9 @@
     <w:p>
       <w:pPr>
         <w:pStyle w:val="ListParagraph"/>
+        <w:keepNext/>
+        <w:keepLines/>
+        <w:widowControl/>
         <w:numPr>
           <w:ilvl w:val="0"/>
           <w:numId w:val="13"/>
@@ -1009,6 +1123,9 @@
     <w:p>
       <w:pPr>
         <w:pStyle w:val="ListParagraph"/>
+        <w:keepNext/>
+        <w:keepLines/>
+        <w:widowControl/>
         <w:numPr>
           <w:ilvl w:val="0"/>
           <w:numId w:val="28"/>
@@ -1048,6 +1165,9 @@
     <w:p>
       <w:pPr>
         <w:pStyle w:val="ListParagraph"/>
+        <w:keepNext/>
+        <w:keepLines/>
+        <w:widowControl/>
         <w:numPr>
           <w:ilvl w:val="0"/>
           <w:numId w:val="28"/>
@@ -1073,6 +1193,9 @@
     <w:p>
       <w:pPr>
         <w:pStyle w:val="ListParagraph"/>
+        <w:keepNext w:val="0"/>
+        <w:keepLines/>
+        <w:widowControl/>
         <w:numPr>
           <w:ilvl w:val="0"/>
           <w:numId w:val="28"/>
@@ -1098,6 +1221,9 @@
     <w:p>
       <w:pPr>
         <w:pStyle w:val="ListParagraph"/>
+        <w:keepNext/>
+        <w:keepLines/>
+        <w:widowControl/>
         <w:numPr>
           <w:ilvl w:val="0"/>
           <w:numId w:val="13"/>
@@ -1127,6 +1253,9 @@
     <w:p>
       <w:pPr>
         <w:pStyle w:val="ListParagraph"/>
+        <w:keepNext/>
+        <w:keepLines/>
+        <w:widowControl/>
         <w:numPr>
           <w:ilvl w:val="0"/>
           <w:numId w:val="30"/>
@@ -1152,6 +1281,9 @@
     <w:p>
       <w:pPr>
         <w:pStyle w:val="ListParagraph"/>
+        <w:keepNext/>
+        <w:keepLines/>
+        <w:widowControl/>
         <w:numPr>
           <w:ilvl w:val="0"/>
           <w:numId w:val="30"/>
@@ -1177,6 +1309,9 @@
     <w:p>
       <w:pPr>
         <w:pStyle w:val="ListParagraph"/>
+        <w:keepNext/>
+        <w:keepLines/>
+        <w:widowControl/>
         <w:numPr>
           <w:ilvl w:val="0"/>
           <w:numId w:val="30"/>
@@ -1202,6 +1337,9 @@
     <w:p>
       <w:pPr>
         <w:pStyle w:val="ListParagraph"/>
+        <w:keepNext/>
+        <w:keepLines/>
+        <w:widowControl/>
         <w:numPr>
           <w:ilvl w:val="0"/>
           <w:numId w:val="30"/>
@@ -1227,6 +1365,9 @@
     <w:p>
       <w:pPr>
         <w:pStyle w:val="ListParagraph"/>
+        <w:keepNext w:val="0"/>
+        <w:keepLines/>
+        <w:widowControl/>
         <w:numPr>
           <w:ilvl w:val="0"/>
           <w:numId w:val="30"/>
@@ -1252,6 +1393,9 @@
     <w:p>
       <w:pPr>
         <w:pStyle w:val="ListParagraph"/>
+        <w:keepNext/>
+        <w:keepLines/>
+        <w:widowControl/>
         <w:numPr>
           <w:ilvl w:val="0"/>
           <w:numId w:val="13"/>
@@ -1279,6 +1423,9 @@
     <w:p>
       <w:pPr>
         <w:pStyle w:val="NormalWeb"/>
+        <w:keepNext/>
+        <w:keepLines/>
+        <w:widowControl/>
         <w:numPr>
           <w:ilvl w:val="0"/>
           <w:numId w:val="31"/>
@@ -1326,6 +1473,9 @@
     <w:p>
       <w:pPr>
         <w:pStyle w:val="NormalWeb"/>
+        <w:keepNext/>
+        <w:keepLines/>
+        <w:widowControl/>
         <w:numPr>
           <w:ilvl w:val="0"/>
           <w:numId w:val="31"/>
@@ -1354,6 +1504,9 @@
     <w:p>
       <w:pPr>
         <w:pStyle w:val="NormalWeb"/>
+        <w:keepNext/>
+        <w:keepLines/>
+        <w:widowControl/>
         <w:spacing w:before="0" w:beforeAutospacing="0" w:after="240" w:afterAutospacing="0"/>
         <w:jc w:val="both"/>
         <w:rPr>
@@ -1374,6 +1527,9 @@
     <w:p>
       <w:pPr>
         <w:pStyle w:val="NormalWeb"/>
+        <w:keepNext/>
+        <w:keepLines/>
+        <w:widowControl/>
         <w:spacing w:before="0" w:beforeAutospacing="0" w:after="240" w:afterAutospacing="0"/>
         <w:jc w:val="both"/>
         <w:rPr>
@@ -1395,6 +1551,9 @@
     <w:p>
       <w:pPr>
         <w:pStyle w:val="NormalWeb"/>
+        <w:keepNext/>
+        <w:keepLines/>
+        <w:widowControl/>
         <w:spacing w:before="0" w:beforeAutospacing="0" w:after="240" w:afterAutospacing="0"/>
         <w:jc w:val="both"/>
         <w:rPr>
@@ -1415,6 +1574,9 @@
     <w:p>
       <w:pPr>
         <w:pStyle w:val="NormalWeb"/>
+        <w:keepNext/>
+        <w:keepLines/>
+        <w:widowControl/>
         <w:spacing w:before="0" w:beforeAutospacing="0" w:after="240" w:afterAutospacing="0"/>
         <w:jc w:val="both"/>
         <w:rPr>
@@ -1435,6 +1597,9 @@
     <w:p>
       <w:pPr>
         <w:pStyle w:val="NormalWeb"/>
+        <w:keepNext/>
+        <w:keepLines/>
+        <w:widowControl/>
         <w:spacing w:before="0" w:beforeAutospacing="0" w:after="240" w:afterAutospacing="0"/>
         <w:jc w:val="both"/>
         <w:rPr>
@@ -1455,6 +1620,9 @@
     <w:p>
       <w:pPr>
         <w:pStyle w:val="NormalWeb"/>
+        <w:keepNext/>
+        <w:keepLines/>
+        <w:widowControl/>
         <w:spacing w:before="0" w:beforeAutospacing="0" w:after="240" w:afterAutospacing="0"/>
         <w:jc w:val="both"/>
         <w:rPr>
@@ -1475,6 +1643,9 @@
     <w:p>
       <w:pPr>
         <w:pStyle w:val="NormalWeb"/>
+        <w:keepNext/>
+        <w:keepLines/>
+        <w:widowControl/>
         <w:numPr>
           <w:ilvl w:val="0"/>
           <w:numId w:val="31"/>
@@ -1503,6 +1674,9 @@
     <w:p>
       <w:pPr>
         <w:pStyle w:val="NormalWeb"/>
+        <w:keepNext w:val="0"/>
+        <w:keepLines/>
+        <w:widowControl/>
         <w:numPr>
           <w:ilvl w:val="0"/>
           <w:numId w:val="31"/>
@@ -1531,6 +1705,9 @@
     <w:p>
       <w:pPr>
         <w:pStyle w:val="ListParagraph"/>
+        <w:keepNext/>
+        <w:keepLines/>
+        <w:widowControl/>
         <w:numPr>
           <w:ilvl w:val="0"/>
           <w:numId w:val="13"/>
@@ -1557,6 +1734,9 @@
     </w:p>
     <w:p>
       <w:pPr>
+        <w:keepNext w:val="0"/>
+        <w:keepLines/>
+        <w:widowControl/>
         <w:spacing w:after="240" w:line="240" w:lineRule="auto"/>
         <w:jc w:val="both"/>
         <w:rPr>
@@ -1575,6 +1755,9 @@
     <w:p>
       <w:pPr>
         <w:pStyle w:val="ListParagraph"/>
+        <w:keepNext/>
+        <w:keepLines/>
+        <w:widowControl/>
         <w:numPr>
           <w:ilvl w:val="0"/>
           <w:numId w:val="13"/>
@@ -1601,6 +1784,9 @@
     </w:p>
     <w:p>
       <w:pPr>
+        <w:keepNext w:val="0"/>
+        <w:keepLines/>
+        <w:widowControl/>
         <w:spacing w:after="240" w:line="240" w:lineRule="auto"/>
         <w:jc w:val="both"/>
         <w:rPr>
@@ -1633,6 +1819,9 @@
     <w:p>
       <w:pPr>
         <w:pStyle w:val="ListParagraph"/>
+        <w:keepNext/>
+        <w:keepLines/>
+        <w:widowControl/>
         <w:numPr>
           <w:ilvl w:val="0"/>
           <w:numId w:val="13"/>
@@ -1659,6 +1848,9 @@
     </w:p>
     <w:p>
       <w:pPr>
+        <w:keepNext w:val="0"/>
+        <w:keepLines/>
+        <w:widowControl/>
         <w:spacing w:after="240" w:line="240" w:lineRule="auto"/>
         <w:jc w:val="both"/>
         <w:rPr>
@@ -1677,6 +1869,9 @@
     <w:p>
       <w:pPr>
         <w:pStyle w:val="ListParagraph"/>
+        <w:keepNext/>
+        <w:keepLines/>
+        <w:widowControl/>
         <w:numPr>
           <w:ilvl w:val="0"/>
           <w:numId w:val="13"/>
@@ -1705,6 +1900,9 @@
     </w:p>
     <w:p>
       <w:pPr>
+        <w:keepNext w:val="0"/>
+        <w:keepLines/>
+        <w:widowControl/>
         <w:spacing w:after="240" w:line="240" w:lineRule="auto"/>
         <w:jc w:val="both"/>
         <w:rPr>
@@ -1723,6 +1921,9 @@
     <w:p>
       <w:pPr>
         <w:pStyle w:val="ListParagraph"/>
+        <w:keepNext/>
+        <w:keepLines/>
+        <w:widowControl/>
         <w:numPr>
           <w:ilvl w:val="0"/>
           <w:numId w:val="13"/>
@@ -1749,6 +1950,9 @@
     </w:p>
     <w:p>
       <w:pPr>
+        <w:keepNext w:val="0"/>
+        <w:keepLines/>
+        <w:widowControl/>
         <w:spacing w:after="240" w:line="240" w:lineRule="auto"/>
         <w:jc w:val="both"/>
         <w:rPr>
@@ -1779,6 +1983,9 @@
     <w:p>
       <w:pPr>
         <w:pStyle w:val="ListParagraph"/>
+        <w:keepNext/>
+        <w:keepLines/>
+        <w:widowControl/>
         <w:numPr>
           <w:ilvl w:val="0"/>
           <w:numId w:val="13"/>
@@ -1806,6 +2013,9 @@
     </w:p>
     <w:p>
       <w:pPr>
+        <w:keepNext/>
+        <w:keepLines/>
+        <w:widowControl/>
         <w:pBdr>
           <w:bottom w:val="single" w:sz="4" w:space="31" w:color="auto"/>
         </w:pBdr>
@@ -1824,6 +2034,9 @@
     </w:p>
     <w:p>
       <w:pPr>
+        <w:keepNext w:val="0"/>
+        <w:keepLines/>
+        <w:widowControl/>
         <w:pBdr>
           <w:bottom w:val="single" w:sz="4" w:space="31" w:color="auto"/>
         </w:pBdr>
@@ -1841,6 +2054,9 @@
     </w:p>
     <w:p>
       <w:pPr>
+        <w:keepNext/>
+        <w:keepLines/>
+        <w:widowControl/>
         <w:pBdr>
           <w:bottom w:val="single" w:sz="4" w:space="31" w:color="auto"/>
         </w:pBdr>
@@ -1862,6 +2078,9 @@
     </w:p>
     <w:p>
       <w:pPr>
+        <w:keepNext/>
+        <w:keepLines/>
+        <w:widowControl/>
         <w:pBdr>
           <w:bottom w:val="single" w:sz="4" w:space="31" w:color="auto"/>
         </w:pBdr>
@@ -1885,6 +2104,9 @@
     </w:p>
     <w:p>
       <w:pPr>
+        <w:keepNext/>
+        <w:keepLines/>
+        <w:widowControl/>
         <w:pBdr>
           <w:bottom w:val="single" w:sz="4" w:space="31" w:color="auto"/>
         </w:pBdr>
@@ -1897,6 +2119,9 @@
     </w:p>
     <w:p>
       <w:pPr>
+        <w:keepNext/>
+        <w:keepLines/>
+        <w:widowControl/>
         <w:pBdr>
           <w:bottom w:val="single" w:sz="4" w:space="31" w:color="auto"/>
         </w:pBdr>
@@ -1918,6 +2143,9 @@
     </w:p>
     <w:p>
       <w:pPr>
+        <w:keepNext/>
+        <w:keepLines/>
+        <w:widowControl/>
         <w:pBdr>
           <w:bottom w:val="single" w:sz="4" w:space="31" w:color="auto"/>
         </w:pBdr>
@@ -1937,6 +2165,9 @@
     </w:p>
     <w:p>
       <w:pPr>
+        <w:keepNext/>
+        <w:keepLines/>
+        <w:widowControl/>
         <w:pBdr>
           <w:bottom w:val="single" w:sz="4" w:space="31" w:color="auto"/>
         </w:pBdr>
@@ -1956,6 +2187,9 @@
     </w:p>
     <w:p>
       <w:pPr>
+        <w:keepNext/>
+        <w:keepLines/>
+        <w:widowControl/>
         <w:pBdr>
           <w:bottom w:val="single" w:sz="4" w:space="31" w:color="auto"/>
         </w:pBdr>
@@ -2023,6 +2257,9 @@
     </w:p>
     <w:p>
       <w:pPr>
+        <w:keepNext/>
+        <w:keepLines/>
+        <w:widowControl/>
         <w:pBdr>
           <w:bottom w:val="single" w:sz="4" w:space="31" w:color="auto"/>
         </w:pBdr>
@@ -2035,6 +2272,9 @@
     </w:p>
     <w:p>
       <w:pPr>
+        <w:keepNext/>
+        <w:keepLines/>
+        <w:widowControl/>
         <w:pBdr>
           <w:bottom w:val="single" w:sz="4" w:space="31" w:color="auto"/>
         </w:pBdr>
@@ -2047,6 +2287,9 @@
     </w:p>
     <w:p>
       <w:pPr>
+        <w:keepNext/>
+        <w:keepLines/>
+        <w:widowControl/>
         <w:pBdr>
           <w:bottom w:val="single" w:sz="4" w:space="31" w:color="auto"/>
         </w:pBdr>
@@ -2070,6 +2313,9 @@
     </w:p>
     <w:p>
       <w:pPr>
+        <w:keepNext/>
+        <w:keepLines/>
+        <w:widowControl/>
         <w:pBdr>
           <w:bottom w:val="single" w:sz="4" w:space="31" w:color="auto"/>
         </w:pBdr>
@@ -2084,6 +2330,9 @@
     </w:p>
     <w:p>
       <w:pPr>
+        <w:keepNext/>
+        <w:keepLines/>
+        <w:widowControl/>
         <w:pBdr>
           <w:bottom w:val="single" w:sz="4" w:space="31" w:color="auto"/>
         </w:pBdr>
@@ -2105,6 +2354,9 @@
     </w:p>
     <w:p>
       <w:pPr>
+        <w:keepNext/>
+        <w:keepLines/>
+        <w:widowControl/>
         <w:pBdr>
           <w:bottom w:val="single" w:sz="4" w:space="31" w:color="auto"/>
         </w:pBdr>
@@ -2184,6 +2436,9 @@
     </w:p>
     <w:p>
       <w:pPr>
+        <w:keepNext w:val="0"/>
+        <w:keepLines/>
+        <w:widowControl/>
         <w:pBdr>
           <w:bottom w:val="single" w:sz="4" w:space="31" w:color="auto"/>
         </w:pBdr>
@@ -2251,6 +2506,9 @@
     </w:p>
     <w:p>
       <w:pPr>
+        <w:keepNext w:val="0"/>
+        <w:keepLines/>
+        <w:widowControl/>
         <w:spacing w:after="240" w:line="240" w:lineRule="auto"/>
         <w:jc w:val="both"/>
         <w:rPr>
@@ -2260,6 +2518,10 @@
     </w:p>
     <w:p>
       <w:pPr>
+        <w:keepNext/>
+        <w:keepLines/>
+        <w:pageBreakBefore/>
+        <w:widowControl/>
         <w:rPr>
           <w:rFonts w:eastAsia="Times New Roman" w:cstheme="minorHAnsi"/>
           <w:b/>
@@ -2273,7 +2535,6 @@
           <w:rFonts w:cstheme="minorHAnsi"/>
           <w:lang w:val="en-MY"/>
         </w:rPr>
-        <w:br w:type="page"/>
       </w:r>
       <w:r>
         <w:rPr>
@@ -2289,6 +2550,9 @@
     </w:p>
     <w:p>
       <w:pPr>
+        <w:keepNext w:val="0"/>
+        <w:keepLines/>
+        <w:widowControl/>
         <w:adjustRightInd w:val="0"/>
         <w:snapToGrid w:val="0"/>
         <w:spacing w:line="240" w:lineRule="auto"/>
@@ -2307,6 +2571,9 @@
     </w:p>
     <w:p>
       <w:pPr>
+        <w:keepNext/>
+        <w:keepLines/>
+        <w:widowControl/>
         <w:adjustRightInd w:val="0"/>
         <w:snapToGrid w:val="0"/>
         <w:spacing w:line="240" w:lineRule="auto"/>
@@ -2330,6 +2597,9 @@
     </w:p>
     <w:p>
       <w:pPr>
+        <w:keepNext/>
+        <w:keepLines/>
+        <w:widowControl/>
         <w:adjustRightInd w:val="0"/>
         <w:snapToGrid w:val="0"/>
         <w:spacing w:line="240" w:lineRule="auto"/>
@@ -2349,6 +2619,9 @@
     <w:p>
       <w:pPr>
         <w:pStyle w:val="ListParagraph"/>
+        <w:keepNext/>
+        <w:keepLines/>
+        <w:widowControl/>
         <w:numPr>
           <w:ilvl w:val="1"/>
           <w:numId w:val="36"/>
@@ -2373,6 +2646,9 @@
     <w:p>
       <w:pPr>
         <w:pStyle w:val="ListParagraph"/>
+        <w:keepNext/>
+        <w:keepLines/>
+        <w:widowControl/>
         <w:numPr>
           <w:ilvl w:val="1"/>
           <w:numId w:val="36"/>
@@ -2397,6 +2673,9 @@
     <w:p>
       <w:pPr>
         <w:pStyle w:val="ListParagraph"/>
+        <w:keepNext/>
+        <w:keepLines/>
+        <w:widowControl/>
         <w:numPr>
           <w:ilvl w:val="1"/>
           <w:numId w:val="36"/>
@@ -2421,6 +2700,9 @@
     <w:p>
       <w:pPr>
         <w:pStyle w:val="ListParagraph"/>
+        <w:keepNext/>
+        <w:keepLines/>
+        <w:widowControl/>
         <w:numPr>
           <w:ilvl w:val="1"/>
           <w:numId w:val="36"/>
@@ -2445,6 +2727,9 @@
     <w:p>
       <w:pPr>
         <w:pStyle w:val="ListParagraph"/>
+        <w:keepNext/>
+        <w:keepLines/>
+        <w:widowControl/>
         <w:numPr>
           <w:ilvl w:val="1"/>
           <w:numId w:val="36"/>
@@ -2469,6 +2754,9 @@
     <w:p>
       <w:pPr>
         <w:pStyle w:val="ListParagraph"/>
+        <w:keepNext/>
+        <w:keepLines/>
+        <w:widowControl/>
         <w:numPr>
           <w:ilvl w:val="1"/>
           <w:numId w:val="36"/>
@@ -2493,6 +2781,9 @@
     <w:p>
       <w:pPr>
         <w:pStyle w:val="ListParagraph"/>
+        <w:keepNext w:val="0"/>
+        <w:keepLines/>
+        <w:widowControl/>
         <w:numPr>
           <w:ilvl w:val="1"/>
           <w:numId w:val="36"/>
@@ -2517,6 +2808,9 @@
     <w:p>
       <w:pPr>
         <w:pStyle w:val="ListParagraph"/>
+        <w:keepNext w:val="0"/>
+        <w:keepLines/>
+        <w:widowControl/>
         <w:adjustRightInd w:val="0"/>
         <w:snapToGrid w:val="0"/>
         <w:spacing w:line="240" w:lineRule="auto"/>
@@ -2529,6 +2823,9 @@
     </w:p>
     <w:p>
       <w:pPr>
+        <w:keepNext/>
+        <w:keepLines/>
+        <w:widowControl/>
         <w:adjustRightInd w:val="0"/>
         <w:snapToGrid w:val="0"/>
         <w:spacing w:line="240" w:lineRule="auto"/>
@@ -2552,6 +2849,9 @@
     </w:p>
     <w:p>
       <w:pPr>
+        <w:keepNext/>
+        <w:keepLines/>
+        <w:widowControl/>
         <w:adjustRightInd w:val="0"/>
         <w:snapToGrid w:val="0"/>
         <w:spacing w:line="240" w:lineRule="auto"/>
@@ -2571,6 +2871,9 @@
     <w:p>
       <w:pPr>
         <w:pStyle w:val="ListParagraph"/>
+        <w:keepNext/>
+        <w:keepLines/>
+        <w:widowControl/>
         <w:numPr>
           <w:ilvl w:val="0"/>
           <w:numId w:val="37"/>
@@ -2595,6 +2898,9 @@
     <w:p>
       <w:pPr>
         <w:pStyle w:val="ListParagraph"/>
+        <w:keepNext/>
+        <w:keepLines/>
+        <w:widowControl/>
         <w:numPr>
           <w:ilvl w:val="0"/>
           <w:numId w:val="37"/>
@@ -2619,6 +2925,9 @@
     <w:p>
       <w:pPr>
         <w:pStyle w:val="ListParagraph"/>
+        <w:keepNext/>
+        <w:keepLines/>
+        <w:widowControl/>
         <w:numPr>
           <w:ilvl w:val="0"/>
           <w:numId w:val="37"/>
@@ -2643,6 +2952,9 @@
     <w:p>
       <w:pPr>
         <w:pStyle w:val="ListParagraph"/>
+        <w:keepNext/>
+        <w:keepLines/>
+        <w:widowControl/>
         <w:numPr>
           <w:ilvl w:val="0"/>
           <w:numId w:val="37"/>
@@ -2667,6 +2979,9 @@
     <w:p>
       <w:pPr>
         <w:pStyle w:val="ListParagraph"/>
+        <w:keepNext w:val="0"/>
+        <w:keepLines/>
+        <w:widowControl/>
         <w:numPr>
           <w:ilvl w:val="0"/>
           <w:numId w:val="37"/>
@@ -2698,6 +3013,9 @@
     <w:p>
       <w:pPr>
         <w:pStyle w:val="ListParagraph"/>
+        <w:keepNext w:val="0"/>
+        <w:keepLines/>
+        <w:widowControl/>
         <w:adjustRightInd w:val="0"/>
         <w:snapToGrid w:val="0"/>
         <w:spacing w:line="240" w:lineRule="auto"/>
@@ -2710,6 +3028,9 @@
     </w:p>
     <w:p>
       <w:pPr>
+        <w:keepNext/>
+        <w:keepLines/>
+        <w:widowControl/>
         <w:adjustRightInd w:val="0"/>
         <w:snapToGrid w:val="0"/>
         <w:spacing w:line="240" w:lineRule="auto"/>
@@ -2733,6 +3054,9 @@
     </w:p>
     <w:p>
       <w:pPr>
+        <w:keepNext/>
+        <w:keepLines/>
+        <w:widowControl/>
         <w:adjustRightInd w:val="0"/>
         <w:snapToGrid w:val="0"/>
         <w:spacing w:line="240" w:lineRule="auto"/>
@@ -2753,6 +3077,9 @@
     <w:p>
       <w:pPr>
         <w:pStyle w:val="ListParagraph"/>
+        <w:keepNext/>
+        <w:keepLines/>
+        <w:widowControl/>
         <w:numPr>
           <w:ilvl w:val="0"/>
           <w:numId w:val="39"/>
@@ -2777,6 +3104,9 @@
     <w:p>
       <w:pPr>
         <w:pStyle w:val="ListParagraph"/>
+        <w:keepNext/>
+        <w:keepLines/>
+        <w:widowControl/>
         <w:numPr>
           <w:ilvl w:val="0"/>
           <w:numId w:val="39"/>
@@ -2801,6 +3131,9 @@
     <w:p>
       <w:pPr>
         <w:pStyle w:val="ListParagraph"/>
+        <w:keepNext/>
+        <w:keepLines/>
+        <w:widowControl/>
         <w:numPr>
           <w:ilvl w:val="0"/>
           <w:numId w:val="39"/>
@@ -2825,6 +3158,9 @@
     <w:p>
       <w:pPr>
         <w:pStyle w:val="ListParagraph"/>
+        <w:keepNext/>
+        <w:keepLines/>
+        <w:widowControl/>
         <w:numPr>
           <w:ilvl w:val="0"/>
           <w:numId w:val="39"/>
@@ -2849,6 +3185,9 @@
     <w:p>
       <w:pPr>
         <w:pStyle w:val="ListParagraph"/>
+        <w:keepNext w:val="0"/>
+        <w:keepLines/>
+        <w:widowControl/>
         <w:numPr>
           <w:ilvl w:val="0"/>
           <w:numId w:val="39"/>
@@ -2879,6 +3218,9 @@
     </w:p>
     <w:p>
       <w:pPr>
+        <w:keepNext/>
+        <w:keepLines/>
+        <w:widowControl/>
         <w:adjustRightInd w:val="0"/>
         <w:snapToGrid w:val="0"/>
         <w:spacing w:line="240" w:lineRule="auto"/>
@@ -2902,6 +3244,9 @@
     </w:p>
     <w:p>
       <w:pPr>
+        <w:keepNext/>
+        <w:keepLines/>
+        <w:widowControl/>
         <w:adjustRightInd w:val="0"/>
         <w:snapToGrid w:val="0"/>
         <w:spacing w:line="240" w:lineRule="auto"/>
@@ -2921,6 +3266,9 @@
     </w:p>
     <w:p>
       <w:pPr>
+        <w:keepNext/>
+        <w:keepLines/>
+        <w:widowControl/>
         <w:numPr>
           <w:ilvl w:val="0"/>
           <w:numId w:val="41"/>
@@ -2949,6 +3297,9 @@
     </w:p>
     <w:p>
       <w:pPr>
+        <w:keepNext/>
+        <w:keepLines/>
+        <w:widowControl/>
         <w:numPr>
           <w:ilvl w:val="0"/>
           <w:numId w:val="41"/>
@@ -2978,6 +3329,9 @@
     </w:p>
     <w:p>
       <w:pPr>
+        <w:keepNext/>
+        <w:keepLines/>
+        <w:widowControl/>
         <w:numPr>
           <w:ilvl w:val="0"/>
           <w:numId w:val="41"/>
@@ -3006,6 +3360,9 @@
     </w:p>
     <w:p>
       <w:pPr>
+        <w:keepNext/>
+        <w:keepLines/>
+        <w:widowControl/>
         <w:numPr>
           <w:ilvl w:val="0"/>
           <w:numId w:val="41"/>
@@ -3034,6 +3391,9 @@
     </w:p>
     <w:p>
       <w:pPr>
+        <w:keepNext/>
+        <w:keepLines/>
+        <w:widowControl/>
         <w:numPr>
           <w:ilvl w:val="0"/>
           <w:numId w:val="41"/>
@@ -3062,6 +3422,9 @@
     </w:p>
     <w:p>
       <w:pPr>
+        <w:keepNext w:val="0"/>
+        <w:keepLines/>
+        <w:widowControl/>
         <w:numPr>
           <w:ilvl w:val="0"/>
           <w:numId w:val="41"/>
@@ -3097,6 +3460,9 @@
     </w:p>
     <w:p>
       <w:pPr>
+        <w:keepNext w:val="0"/>
+        <w:keepLines/>
+        <w:widowControl/>
         <w:adjustRightInd w:val="0"/>
         <w:snapToGrid w:val="0"/>
         <w:spacing w:after="0" w:line="240" w:lineRule="auto"/>
@@ -3110,6 +3476,9 @@
     </w:p>
     <w:p>
       <w:pPr>
+        <w:keepNext/>
+        <w:keepLines/>
+        <w:widowControl/>
         <w:adjustRightInd w:val="0"/>
         <w:snapToGrid w:val="0"/>
         <w:spacing w:line="240" w:lineRule="auto"/>
@@ -3134,6 +3503,9 @@
     </w:p>
     <w:p>
       <w:pPr>
+        <w:keepNext/>
+        <w:keepLines/>
+        <w:widowControl/>
         <w:adjustRightInd w:val="0"/>
         <w:snapToGrid w:val="0"/>
         <w:spacing w:line="240" w:lineRule="auto"/>
@@ -3153,6 +3525,9 @@
     </w:p>
     <w:p>
       <w:pPr>
+        <w:keepNext/>
+        <w:keepLines/>
+        <w:widowControl/>
         <w:numPr>
           <w:ilvl w:val="0"/>
           <w:numId w:val="42"/>
@@ -3181,6 +3556,9 @@
     </w:p>
     <w:p>
       <w:pPr>
+        <w:keepNext/>
+        <w:keepLines/>
+        <w:widowControl/>
         <w:numPr>
           <w:ilvl w:val="0"/>
           <w:numId w:val="42"/>
@@ -3209,6 +3587,9 @@
     </w:p>
     <w:p>
       <w:pPr>
+        <w:keepNext/>
+        <w:keepLines/>
+        <w:widowControl/>
         <w:numPr>
           <w:ilvl w:val="0"/>
           <w:numId w:val="42"/>
@@ -3237,6 +3618,9 @@
     </w:p>
     <w:p>
       <w:pPr>
+        <w:keepNext/>
+        <w:keepLines/>
+        <w:widowControl/>
         <w:numPr>
           <w:ilvl w:val="0"/>
           <w:numId w:val="42"/>
@@ -3265,6 +3649,9 @@
     </w:p>
     <w:p>
       <w:pPr>
+        <w:keepNext/>
+        <w:keepLines/>
+        <w:widowControl/>
         <w:numPr>
           <w:ilvl w:val="0"/>
           <w:numId w:val="42"/>
@@ -3293,6 +3680,9 @@
     </w:p>
     <w:p>
       <w:pPr>
+        <w:keepNext/>
+        <w:keepLines/>
+        <w:widowControl/>
         <w:numPr>
           <w:ilvl w:val="0"/>
           <w:numId w:val="42"/>
@@ -3321,6 +3711,9 @@
     </w:p>
     <w:p>
       <w:pPr>
+        <w:keepNext/>
+        <w:keepLines/>
+        <w:widowControl/>
         <w:adjustRightInd w:val="0"/>
         <w:snapToGrid w:val="0"/>
         <w:spacing w:after="0" w:line="240" w:lineRule="auto"/>
@@ -3334,6 +3727,9 @@
     </w:p>
     <w:p>
       <w:pPr>
+        <w:keepNext w:val="0"/>
+        <w:keepLines/>
+        <w:widowControl/>
         <w:adjustRightInd w:val="0"/>
         <w:snapToGrid w:val="0"/>
         <w:spacing w:line="240" w:lineRule="auto"/>
@@ -3353,6 +3749,9 @@
     </w:p>
     <w:p>
       <w:pPr>
+        <w:keepNext/>
+        <w:keepLines/>
+        <w:widowControl/>
         <w:adjustRightInd w:val="0"/>
         <w:snapToGrid w:val="0"/>
         <w:spacing w:line="240" w:lineRule="auto"/>
@@ -3377,6 +3776,9 @@
     </w:p>
     <w:p>
       <w:pPr>
+        <w:keepNext/>
+        <w:keepLines/>
+        <w:widowControl/>
         <w:adjustRightInd w:val="0"/>
         <w:snapToGrid w:val="0"/>
         <w:spacing w:line="240" w:lineRule="auto"/>
@@ -3396,6 +3798,9 @@
     </w:p>
     <w:p>
       <w:pPr>
+        <w:keepNext/>
+        <w:keepLines/>
+        <w:widowControl/>
         <w:numPr>
           <w:ilvl w:val="0"/>
           <w:numId w:val="43"/>
@@ -3424,6 +3829,9 @@
     </w:p>
     <w:p>
       <w:pPr>
+        <w:keepNext/>
+        <w:keepLines/>
+        <w:widowControl/>
         <w:numPr>
           <w:ilvl w:val="0"/>
           <w:numId w:val="43"/>
@@ -3452,6 +3860,9 @@
     </w:p>
     <w:p>
       <w:pPr>
+        <w:keepNext/>
+        <w:keepLines/>
+        <w:widowControl/>
         <w:numPr>
           <w:ilvl w:val="0"/>
           <w:numId w:val="43"/>
@@ -3480,6 +3891,9 @@
     </w:p>
     <w:p>
       <w:pPr>
+        <w:keepNext w:val="0"/>
+        <w:keepLines/>
+        <w:widowControl/>
         <w:numPr>
           <w:ilvl w:val="0"/>
           <w:numId w:val="43"/>
@@ -3508,6 +3922,9 @@
     </w:p>
     <w:p>
       <w:pPr>
+        <w:keepNext w:val="0"/>
+        <w:keepLines/>
+        <w:widowControl/>
         <w:spacing w:line="240" w:lineRule="auto"/>
         <w:rPr>
           <w:rFonts w:cstheme="minorHAnsi"/>

</xml_diff>